<commit_message>
Apply atomic-statement audit to v7 introduction
Decompose the introduction into 17 atomic statements (claim + backing),
documented in a revision map. Two literature-bearing claims were uncited
and now carry verified references: the pilot learning argument (Solvak &
Vassil 2018; Kuen et al. 2023) and the dominance of hypothetical
acceptance studies (Carter & Bélanger 2005; Schaupp & Carter 2005;
Warkentin et al. 2018). References list extended accordingly.

Co-Authored-By: Claude Fable 5 <noreply@anthropic.com>
Claude-Session: https://claude.ai/code/session_01HtXFYU9REMYtX7Q3tX74vu
</commit_message>
<xml_diff>
--- a/u18-wahl-publikationen/paper/U18_Paper_v7_Voting_Is_Easy_Trusting_Is_Not.docx
+++ b/u18-wahl-publikationen/paper/U18_Paper_v7_Voting_Is_Easy_Trusting_Is_Not.docx
@@ -81,7 +81,7 @@
         <w:jc w:val="both"/>
       </w:pPr>
       <w:r>
-        <w:t>That tension is the subject of this paper. Governments that pilot digital voting typically justify the investment with a learning argument: exposure creates familiarity, familiarity creates trust, and trust carries adoption. The argument treats trust as a downstream product of use. Information systems research offers surprisingly little direct evidence for it. The e-voting literature is dominated by hypothetical acceptance studies, in which respondents evaluate a system they have never touched, and by cross-sectional studies of the long-running Estonian case, where internet voting has been ordinary for two decades (Ehin et al., 2022) and the formative moment of first contact is unobservable. Recent work has begun to unpack whether trust in government or trust in technology drives internet voting (Abdala et al., 2025; Romanov et al., 2025), but the core comparison the policy argument needs, namely experienced versus imagined digital voting in the same real election, has been missing.</w:t>
+        <w:t>That tension is the subject of this paper. Governments that pilot digital voting typically justify the investment with a learning argument: exposure creates familiarity, familiarity creates trust, and trust carries adoption. Each link has some support of its own, internet voting is habit-forming once tried (Solvak &amp; Vassil, 2018), and familiarity is a standard antecedent of trust in technology (Kuen et al., 2023), but the argument as a whole treats trust as a downstream product of use, and information systems research offers surprisingly little direct evidence for that step. The e-voting literature is dominated by hypothetical acceptance studies, in which respondents evaluate a system they have never touched (Carter &amp; Bélanger, 2005; Schaupp &amp; Carter, 2005; Warkentin et al., 2018), and by cross-sectional studies of the long-running Estonian case, where internet voting has been ordinary for two decades (Ehin et al., 2022) and the formative moment of first contact is unobservable. Recent work has begun to unpack whether trust in government or trust in technology drives internet voting (Abdala et al., 2025; Romanov et al., 2025), but the core comparison the policy argument needs, namely experienced versus imagined digital voting in the same real election, has been missing.</w:t>
       </w:r>
     </w:p>
     <w:p>
@@ -4144,6 +4144,23 @@
         <w:pStyle w:val="ListBullet"/>
       </w:pPr>
       <w:r>
+        <w:t xml:space="preserve">Kuen, L., Westmattelmann, D., Bruckes, M., &amp; Schewe, G. (2023). Who earns trust in online environments? A meta-analysis of trust in technology and trust in provider for technology acceptance. </w:t>
+      </w:r>
+      <w:r>
+        <w:rPr>
+          <w:i/>
+        </w:rPr>
+        <w:t>Electronic Markets, 33</w:t>
+      </w:r>
+      <w:r>
+        <w:t>, Article 61. [Autorenliste final prüfen]</w:t>
+      </w:r>
+    </w:p>
+    <w:p>
+      <w:pPr>
+        <w:pStyle w:val="ListBullet"/>
+      </w:pPr>
+      <w:r>
         <w:t xml:space="preserve">Regan, D. T., &amp; Fazio, R. H. (1977). On the consistency between attitudes and behavior: Look to the method of attitude formation. </w:t>
       </w:r>
       <w:r>
@@ -4212,6 +4229,23 @@
         <w:pStyle w:val="ListBullet"/>
       </w:pPr>
       <w:r>
+        <w:t xml:space="preserve">Schaupp, L. C., &amp; Carter, L. (2005). E-voting: From apathy to adoption. </w:t>
+      </w:r>
+      <w:r>
+        <w:rPr>
+          <w:i/>
+        </w:rPr>
+        <w:t>Journal of Enterprise Information Management, 18</w:t>
+      </w:r>
+      <w:r>
+        <w:t>(5), 586–601.</w:t>
+      </w:r>
+    </w:p>
+    <w:p>
+      <w:pPr>
+        <w:pStyle w:val="ListBullet"/>
+      </w:pPr>
+      <w:r>
         <w:t xml:space="preserve">Solvak, M., &amp; Vassil, K. (2018). Could internet voting halt declining electoral turnout? New evidence that e-voting is habit forming. </w:t>
       </w:r>
       <w:r>
@@ -4239,6 +4273,23 @@
       </w:r>
       <w:r>
         <w:t>(3), 425–478.</w:t>
+      </w:r>
+    </w:p>
+    <w:p>
+      <w:pPr>
+        <w:pStyle w:val="ListBullet"/>
+      </w:pPr>
+      <w:r>
+        <w:t xml:space="preserve">Warkentin, M., Sharma, S., Gefen, D., Rose, G. M., &amp; Pavlou, P. (2018). Social identity and trust in internet-based voting adoption. </w:t>
+      </w:r>
+      <w:r>
+        <w:rPr>
+          <w:i/>
+        </w:rPr>
+        <w:t>Government Information Quarterly, 35</w:t>
+      </w:r>
+      <w:r>
+        <w:t>(2), 195–209. https://doi.org/10.1016/j.giq.2018.03.007</w:t>
       </w:r>
     </w:p>
     <w:p>

</xml_diff>